<commit_message>
Refactor free-course-signup.html to streamline the layout by removing unnecessary elements and adjusting the grid structure. Enhance form usability with updated spacing and improved visual consistency.
</commit_message>
<xml_diff>
--- a/scripts/Bright Talks Script Stub Edited 6:5:26.docx
+++ b/scripts/Bright Talks Script Stub Edited 6:5:26.docx
@@ -2,113 +2,6 @@
 <file path=word/document.xml><?xml version="1.0" encoding="utf-8"?>
 <w:document xmlns:wpc="http://schemas.microsoft.com/office/word/2010/wordprocessingCanvas" xmlns:cx="http://schemas.microsoft.com/office/drawing/2014/chartex" xmlns:cx1="http://schemas.microsoft.com/office/drawing/2015/9/8/chartex" xmlns:cx2="http://schemas.microsoft.com/office/drawing/2015/10/21/chartex" xmlns:cx3="http://schemas.microsoft.com/office/drawing/2016/5/9/chartex" xmlns:cx4="http://schemas.microsoft.com/office/drawing/2016/5/10/chartex" xmlns:cx5="http://schemas.microsoft.com/office/drawing/2016/5/11/chartex" xmlns:cx6="http://schemas.microsoft.com/office/drawing/2016/5/12/chartex" xmlns:cx7="http://schemas.microsoft.com/office/drawing/2016/5/13/chartex" xmlns:cx8="http://schemas.microsoft.com/office/drawing/2016/5/14/chartex" xmlns:mc="http://schemas.openxmlformats.org/markup-compatibility/2006" xmlns:aink="http://schemas.microsoft.com/office/drawing/2016/ink" xmlns:am3d="http://schemas.microsoft.com/office/drawing/2017/model3d" xmlns:o="urn:schemas-microsoft-com:office:office" xmlns:oel="http://schemas.microsoft.com/office/2019/extlst" xmlns:r="http://schemas.openxmlformats.org/officeDocument/2006/relationships" xmlns:m="http://schemas.openxmlformats.org/officeDocument/2006/math" xmlns:v="urn:schemas-microsoft-com:vml" xmlns:wp14="http://schemas.microsoft.com/office/word/2010/wordprocessingDrawing" xmlns:wp="http://schemas.openxmlformats.org/drawingml/2006/wordprocessingDrawing" xmlns:w10="urn:schemas-microsoft-com:office:word" xmlns:w="http://schemas.openxmlformats.org/wordprocessingml/2006/main" xmlns:w14="http://schemas.microsoft.com/office/word/2010/wordml" xmlns:w15="http://schemas.microsoft.com/office/word/2012/wordml" xmlns:w16cex="http://schemas.microsoft.com/office/word/2018/wordml/cex" xmlns:w16cid="http://schemas.microsoft.com/office/word/2016/wordml/cid" xmlns:w16="http://schemas.microsoft.com/office/word/2018/wordml" xmlns:w16du="http://schemas.microsoft.com/office/word/2023/wordml/word16du" xmlns:w16sdtdh="http://schemas.microsoft.com/office/word/2020/wordml/sdtdatahash" xmlns:w16sdtfl="http://schemas.microsoft.com/office/word/2024/wordml/sdtformatlock" xmlns:w16se="http://schemas.microsoft.com/office/word/2015/wordml/symex" xmlns:wpg="http://schemas.microsoft.com/office/word/2010/wordprocessingGroup" xmlns:wpi="http://schemas.microsoft.com/office/word/2010/wordprocessingInk" xmlns:wne="http://schemas.microsoft.com/office/word/2006/wordml" xmlns:wps="http://schemas.microsoft.com/office/word/2010/wordprocessingShape" mc:Ignorable="w14 w15 w16se w16cid w16 w16cex w16sdtdh w16sdtfl w16du wp14">
   <w:body>
-    <w:p>
-      <w:pPr>
-        <w:rPr>
-          <w:b/>
-          <w:bCs/>
-        </w:rPr>
-      </w:pPr>
-      <w:r>
-        <w:rPr>
-          <w:b/>
-          <w:bCs/>
-        </w:rPr>
-        <w:t>Video Script: “Bodies, Biology &amp; Anatomy”</w:t>
-      </w:r>
-    </w:p>
-    <w:p/>
-    <w:p>
-      <w:r>
-        <w:rPr>
-          <w:b/>
-          <w:bCs/>
-        </w:rPr>
-        <w:t>Narrator:</w:t>
-      </w:r>
-      <w:r>
-        <w:br/>
-        <w:t>“Every child deserves to grow up understanding their body in a healthy, confident, and age-appropriate way.”</w:t>
-      </w:r>
-    </w:p>
-    <w:p>
-      <w:r>
-        <w:t>“Bodies come in many shapes, sizes, and colors. Some bodies are tall, some are short, some are strong, and some are still growing — and every body deserves respect.”</w:t>
-      </w:r>
-    </w:p>
-    <w:p>
-      <w:r>
-        <w:t>“Learning the correct names for body parts helps kids communicate clearly and confidently. Words like ‘penis,’ ‘vulva,’ ‘chest,’ and ‘bottom’ are just body part names — like elbow or knee.”</w:t>
-      </w:r>
-    </w:p>
-    <w:p>
-      <w:r>
-        <w:t>“Our bodies do amazing things every day. Hearts pump blood, lungs help us breathe, and brains help us learn, feel, and grow.”</w:t>
-      </w:r>
-    </w:p>
-    <w:p>
-      <w:r>
-        <w:t>“As children grow older, their bodies will change too. These changes are a normal part of growing up, and kids should know they can always ask questions.”</w:t>
-      </w:r>
-    </w:p>
-    <w:p>
-      <w:r>
-        <w:rPr>
-          <w:b/>
-          <w:bCs/>
-        </w:rPr>
-        <w:t>Parent</w:t>
-      </w:r>
-      <w:r>
-        <w:rPr>
-          <w:b/>
-          <w:bCs/>
-        </w:rPr>
-        <w:t>:</w:t>
-      </w:r>
-      <w:r>
-        <w:br/>
-        <w:t>“You can always talk to me about your body.”</w:t>
-      </w:r>
-    </w:p>
-    <w:p>
-      <w:r>
-        <w:rPr>
-          <w:b/>
-          <w:bCs/>
-        </w:rPr>
-        <w:t>Narrator:</w:t>
-      </w:r>
-      <w:r>
-        <w:br/>
-        <w:t>“Teaching anatomy also helps children understand body safety. Kids can learn that some body parts are private, and that they have the right to say ‘no’ to unwanted touch.”</w:t>
-      </w:r>
-    </w:p>
-    <w:p>
-      <w:r>
-        <w:t>“When families talk openly and calmly about bodies, children learn respect, confidence, and healthy habits that last a lifetime.”</w:t>
-      </w:r>
-    </w:p>
-    <w:p>
-      <w:r>
-        <w:t>“Small conversations today build trust for tomorrow.”</w:t>
-      </w:r>
-    </w:p>
-    <w:p>
-      <w:r>
-        <w:rPr>
-          <w:b/>
-          <w:bCs/>
-        </w:rPr>
-        <w:t>Professional:</w:t>
-      </w:r>
-    </w:p>
-    <w:p>
-      <w:r>
-        <w:t>“As a parent it is important to talk openly with your child about bodies and boundaries. While this may seem awkward at first, having these conversations with your child will open a path for communication that you know is there, but your child may not know exists. Many people struggle to have conversations like these, don’t presume your child is comfortable, be encouraging, be honest, and let them know they can ask questions, bring up the subjects, and certainly be honest with you. With Bright Talks you have access to professional, scientifically appropriate assets and documentation you can share with your child and more.”</w:t>
-      </w:r>
-    </w:p>
-    <w:p/>
     <w:p>
       <w:pPr>
         <w:spacing w:before="100" w:beforeAutospacing="1" w:after="100" w:afterAutospacing="1" w:line="240" w:lineRule="auto"/>
@@ -133,7 +26,6 @@
           <w:szCs w:val="48"/>
           <w14:ligatures w14:val="none"/>
         </w:rPr>
-        <w:lastRenderedPageBreak/>
         <w:t>Naming Body Parts Without Shame: Building Body Safety, Confidence, and Everyday Communication</w:t>
       </w:r>
     </w:p>
@@ -289,7 +181,7 @@
           <w:noProof/>
           <w:kern w:val="0"/>
         </w:rPr>
-        <w:pict w14:anchorId="6D1D2EB6">
+        <w:pict w14:anchorId="7FCE0F73">
           <v:rect id="_x0000_i1029" alt="" style="width:468pt;height:.05pt;mso-width-percent:0;mso-height-percent:0;mso-width-percent:0;mso-height-percent:0" o:hralign="center" o:hrstd="t" o:hr="t" fillcolor="#a0a0a0" stroked="f"/>
         </w:pict>
       </w:r>
@@ -445,7 +337,7 @@
           <w:kern w:val="0"/>
         </w:rPr>
         <w:lastRenderedPageBreak/>
-        <w:pict w14:anchorId="010043A0">
+        <w:pict w14:anchorId="055C0248">
           <v:rect id="_x0000_i1028" alt="" style="width:468pt;height:.05pt;mso-width-percent:0;mso-height-percent:0;mso-width-percent:0;mso-height-percent:0" o:hralign="center" o:hrstd="t" o:hr="t" fillcolor="#a0a0a0" stroked="f"/>
         </w:pict>
       </w:r>
@@ -582,7 +474,7 @@
           <w:noProof/>
           <w:kern w:val="0"/>
         </w:rPr>
-        <w:pict w14:anchorId="7A29E3ED">
+        <w:pict w14:anchorId="551BC934">
           <v:rect id="_x0000_i1027" alt="" style="width:468pt;height:.05pt;mso-width-percent:0;mso-height-percent:0;mso-width-percent:0;mso-height-percent:0" o:hralign="center" o:hrstd="t" o:hr="t" fillcolor="#a0a0a0" stroked="f"/>
         </w:pict>
       </w:r>
@@ -701,7 +593,7 @@
           <w:noProof/>
           <w:kern w:val="0"/>
         </w:rPr>
-        <w:pict w14:anchorId="0FA491F6">
+        <w:pict w14:anchorId="60613126">
           <v:rect id="_x0000_i1026" alt="" style="width:468pt;height:.05pt;mso-width-percent:0;mso-height-percent:0;mso-width-percent:0;mso-height-percent:0" o:hralign="center" o:hrstd="t" o:hr="t" fillcolor="#a0a0a0" stroked="f"/>
         </w:pict>
       </w:r>
@@ -875,7 +767,7 @@
           <w:noProof/>
           <w:kern w:val="0"/>
         </w:rPr>
-        <w:pict w14:anchorId="1DA441D8">
+        <w:pict w14:anchorId="3B7C26F8">
           <v:rect id="_x0000_i1025" alt="" style="width:468pt;height:.05pt;mso-width-percent:0;mso-height-percent:0;mso-width-percent:0;mso-height-percent:0" o:hralign="center" o:hrstd="t" o:hr="t" fillcolor="#a0a0a0" stroked="f"/>
         </w:pict>
       </w:r>
@@ -996,6 +888,201 @@
         </w:rPr>
         <w:t>This foundation also prepares them to understand God's design for relationships, marriage, intimacy, and sexuality as they grow older.</w:t>
       </w:r>
+    </w:p>
+    <w:p>
+      <w:pPr>
+        <w:spacing w:before="100" w:beforeAutospacing="1" w:after="100" w:afterAutospacing="1" w:line="240" w:lineRule="auto"/>
+        <w:outlineLvl w:val="2"/>
+        <w:rPr>
+          <w:rFonts w:ascii="Times New Roman" w:eastAsia="Times New Roman" w:hAnsi="Times New Roman" w:cs="Times New Roman"/>
+          <w:b/>
+          <w:bCs/>
+          <w:kern w:val="0"/>
+          <w:sz w:val="27"/>
+          <w:szCs w:val="27"/>
+          <w14:ligatures w14:val="none"/>
+        </w:rPr>
+      </w:pPr>
+      <w:r>
+        <w:rPr>
+          <w:rFonts w:ascii="Times New Roman" w:eastAsia="Times New Roman" w:hAnsi="Times New Roman" w:cs="Times New Roman"/>
+          <w:b/>
+          <w:bCs/>
+          <w:kern w:val="0"/>
+          <w:sz w:val="27"/>
+          <w:szCs w:val="27"/>
+          <w14:ligatures w14:val="none"/>
+        </w:rPr>
+        <w:t>Wrapping Up</w:t>
+      </w:r>
+    </w:p>
+    <w:p>
+      <w:pPr>
+        <w:spacing w:before="100" w:beforeAutospacing="1" w:after="100" w:afterAutospacing="1" w:line="240" w:lineRule="auto"/>
+        <w:rPr>
+          <w:rFonts w:ascii="Times New Roman" w:eastAsia="Times New Roman" w:hAnsi="Times New Roman" w:cs="Times New Roman"/>
+          <w:kern w:val="0"/>
+          <w14:ligatures w14:val="none"/>
+        </w:rPr>
+      </w:pPr>
+      <w:r>
+        <w:rPr>
+          <w:rFonts w:ascii="Times New Roman" w:eastAsia="Times New Roman" w:hAnsi="Times New Roman" w:cs="Times New Roman"/>
+          <w:kern w:val="0"/>
+          <w14:ligatures w14:val="none"/>
+        </w:rPr>
+        <w:t>As we close this lesson, remember that you don't need to have all the answers, and you don't need to have one perfect conversation.</w:t>
+      </w:r>
+    </w:p>
+    <w:p>
+      <w:pPr>
+        <w:spacing w:before="100" w:beforeAutospacing="1" w:after="100" w:afterAutospacing="1" w:line="240" w:lineRule="auto"/>
+        <w:rPr>
+          <w:rFonts w:ascii="Times New Roman" w:eastAsia="Times New Roman" w:hAnsi="Times New Roman" w:cs="Times New Roman"/>
+          <w:kern w:val="0"/>
+          <w14:ligatures w14:val="none"/>
+        </w:rPr>
+      </w:pPr>
+      <w:r>
+        <w:rPr>
+          <w:rFonts w:ascii="Times New Roman" w:eastAsia="Times New Roman" w:hAnsi="Times New Roman" w:cs="Times New Roman"/>
+          <w:kern w:val="0"/>
+          <w14:ligatures w14:val="none"/>
+        </w:rPr>
+        <w:t>What matters most is that you're willing to start.</w:t>
+      </w:r>
+    </w:p>
+    <w:p>
+      <w:pPr>
+        <w:spacing w:before="100" w:beforeAutospacing="1" w:after="100" w:afterAutospacing="1" w:line="240" w:lineRule="auto"/>
+        <w:rPr>
+          <w:rFonts w:ascii="Times New Roman" w:eastAsia="Times New Roman" w:hAnsi="Times New Roman" w:cs="Times New Roman"/>
+          <w:kern w:val="0"/>
+          <w14:ligatures w14:val="none"/>
+        </w:rPr>
+      </w:pPr>
+      <w:r>
+        <w:rPr>
+          <w:rFonts w:ascii="Times New Roman" w:eastAsia="Times New Roman" w:hAnsi="Times New Roman" w:cs="Times New Roman"/>
+          <w:kern w:val="0"/>
+          <w14:ligatures w14:val="none"/>
+        </w:rPr>
+        <w:t>Every small conversation you have with your child helps build trust, confidence, and connection. By teaching them about their bodies in a healthy, age-appropriate way, you're creating a foundation for future conversations that will feel more natural and less intimidating as they grow.</w:t>
+      </w:r>
+    </w:p>
+    <w:p>
+      <w:pPr>
+        <w:spacing w:before="100" w:beforeAutospacing="1" w:after="100" w:afterAutospacing="1" w:line="240" w:lineRule="auto"/>
+        <w:rPr>
+          <w:rFonts w:ascii="Times New Roman" w:eastAsia="Times New Roman" w:hAnsi="Times New Roman" w:cs="Times New Roman"/>
+          <w:kern w:val="0"/>
+          <w14:ligatures w14:val="none"/>
+        </w:rPr>
+      </w:pPr>
+      <w:r>
+        <w:rPr>
+          <w:rFonts w:ascii="Times New Roman" w:eastAsia="Times New Roman" w:hAnsi="Times New Roman" w:cs="Times New Roman"/>
+          <w:kern w:val="0"/>
+          <w14:ligatures w14:val="none"/>
+        </w:rPr>
+        <w:t>If this feels new or uncomfortable, that's okay. Many parents are learning alongside their children. The fact that you're here, investing time in these conversations, already makes a difference.</w:t>
+      </w:r>
+    </w:p>
+    <w:p>
+      <w:pPr>
+        <w:spacing w:before="100" w:beforeAutospacing="1" w:after="100" w:afterAutospacing="1" w:line="240" w:lineRule="auto"/>
+        <w:rPr>
+          <w:rFonts w:ascii="Times New Roman" w:eastAsia="Times New Roman" w:hAnsi="Times New Roman" w:cs="Times New Roman"/>
+          <w:kern w:val="0"/>
+          <w14:ligatures w14:val="none"/>
+        </w:rPr>
+      </w:pPr>
+      <w:r>
+        <w:rPr>
+          <w:rFonts w:ascii="Times New Roman" w:eastAsia="Times New Roman" w:hAnsi="Times New Roman" w:cs="Times New Roman"/>
+          <w:kern w:val="0"/>
+          <w14:ligatures w14:val="none"/>
+        </w:rPr>
+        <w:t>Take a moment to reflect on one small step you can take this week. Maybe it's introducing correct body terminology, answering a question with confidence, or simply creating space for curiosity and conversation.</w:t>
+      </w:r>
+    </w:p>
+    <w:p>
+      <w:pPr>
+        <w:spacing w:before="100" w:beforeAutospacing="1" w:after="100" w:afterAutospacing="1" w:line="240" w:lineRule="auto"/>
+        <w:rPr>
+          <w:rFonts w:ascii="Times New Roman" w:eastAsia="Times New Roman" w:hAnsi="Times New Roman" w:cs="Times New Roman"/>
+          <w:kern w:val="0"/>
+          <w14:ligatures w14:val="none"/>
+        </w:rPr>
+      </w:pPr>
+      <w:r>
+        <w:rPr>
+          <w:rFonts w:ascii="Times New Roman" w:eastAsia="Times New Roman" w:hAnsi="Times New Roman" w:cs="Times New Roman"/>
+          <w:kern w:val="0"/>
+          <w14:ligatures w14:val="none"/>
+        </w:rPr>
+        <w:t>You don't have to do everything today. Just take the next step.</w:t>
+      </w:r>
+    </w:p>
+    <w:p>
+      <w:pPr>
+        <w:spacing w:before="100" w:beforeAutospacing="1" w:after="100" w:afterAutospacing="1" w:line="240" w:lineRule="auto"/>
+        <w:rPr>
+          <w:rFonts w:ascii="Times New Roman" w:eastAsia="Times New Roman" w:hAnsi="Times New Roman" w:cs="Times New Roman"/>
+          <w:kern w:val="0"/>
+          <w14:ligatures w14:val="none"/>
+        </w:rPr>
+      </w:pPr>
+      <w:r>
+        <w:rPr>
+          <w:rFonts w:ascii="Times New Roman" w:eastAsia="Times New Roman" w:hAnsi="Times New Roman" w:cs="Times New Roman"/>
+          <w:kern w:val="0"/>
+          <w14:ligatures w14:val="none"/>
+        </w:rPr>
+        <w:t>In our next lesson, we'll build on this foundation by exploring boundaries and body safety</w:t>
+      </w:r>
+      <w:r>
+        <w:rPr>
+          <w:rFonts w:ascii="Times New Roman" w:eastAsia="Times New Roman" w:hAnsi="Times New Roman" w:cs="Times New Roman"/>
+          <w:kern w:val="0"/>
+          <w14:ligatures w14:val="none"/>
+        </w:rPr>
+        <w:t xml:space="preserve"> </w:t>
+      </w:r>
+      <w:r>
+        <w:rPr>
+          <w:rFonts w:ascii="Times New Roman" w:eastAsia="Times New Roman" w:hAnsi="Times New Roman" w:cs="Times New Roman"/>
+          <w:kern w:val="0"/>
+          <w14:ligatures w14:val="none"/>
+        </w:rPr>
+        <w:t>helping children understand personal space, consent, trusted adults, and how to communicate when something doesn't feel right.</w:t>
+      </w:r>
+      <w:r>
+        <w:rPr>
+          <w:rFonts w:ascii="Times New Roman" w:eastAsia="Times New Roman" w:hAnsi="Times New Roman" w:cs="Times New Roman"/>
+          <w:kern w:val="0"/>
+          <w14:ligatures w14:val="none"/>
+        </w:rPr>
+        <w:t xml:space="preserve"> </w:t>
+      </w:r>
+      <w:r>
+        <w:rPr>
+          <w:rFonts w:ascii="Times New Roman" w:eastAsia="Times New Roman" w:hAnsi="Times New Roman" w:cs="Times New Roman"/>
+          <w:kern w:val="0"/>
+          <w14:ligatures w14:val="none"/>
+        </w:rPr>
+        <w:t>We'll see you there.</w:t>
+      </w:r>
+    </w:p>
+    <w:p>
+      <w:pPr>
+        <w:spacing w:before="100" w:beforeAutospacing="1" w:after="100" w:afterAutospacing="1" w:line="240" w:lineRule="auto"/>
+        <w:rPr>
+          <w:rFonts w:ascii="Times New Roman" w:eastAsia="Times New Roman" w:hAnsi="Times New Roman" w:cs="Times New Roman"/>
+          <w:kern w:val="0"/>
+          <w14:ligatures w14:val="none"/>
+        </w:rPr>
+      </w:pPr>
     </w:p>
     <w:p/>
     <w:sectPr>

</xml_diff>